<commit_message>
TP Django rapport 2
</commit_message>
<xml_diff>
--- a/TP Django/Rapport du Travail Pratique.docx
+++ b/TP Django/Rapport du Travail Pratique.docx
@@ -211,13 +211,9 @@
           <w:szCs w:val="52"/>
           <w:lang w:val="fr-FR"/>
         </w:rPr>
-        <w:t>Rapport du Travail Pratique : Système de Boissons</w:t>
-      </w:r>
-    </w:p>
-    <w:p>
-      <w:pPr>
-        <w:pStyle w:val="Heading1"/>
-        <w:jc w:val="center"/>
+        <w:t xml:space="preserve">Rapport du Travail Pratique : </w:t>
+      </w:r>
+      <w:r>
         <w:rPr>
           <w:rFonts w:ascii="Arial Black" w:hAnsi="Arial Black"/>
           <w:color w:val="0D0D0D" w:themeColor="text1" w:themeTint="F2"/>
@@ -225,8 +221,13 @@
           <w:szCs w:val="52"/>
           <w:lang w:val="fr-FR"/>
         </w:rPr>
-      </w:pPr>
-      <w:r>
+        <w:t>ARCHITECTURE DE BASE DE DJANGO</w:t>
+      </w:r>
+    </w:p>
+    <w:p>
+      <w:pPr>
+        <w:pStyle w:val="Heading1"/>
+        <w:jc w:val="center"/>
         <w:rPr>
           <w:rFonts w:ascii="Arial Black" w:hAnsi="Arial Black"/>
           <w:color w:val="0D0D0D" w:themeColor="text1" w:themeTint="F2"/>
@@ -234,6 +235,15 @@
           <w:szCs w:val="52"/>
           <w:lang w:val="fr-FR"/>
         </w:rPr>
+      </w:pPr>
+      <w:r>
+        <w:rPr>
+          <w:rFonts w:ascii="Arial Black" w:hAnsi="Arial Black"/>
+          <w:color w:val="0D0D0D" w:themeColor="text1" w:themeTint="F2"/>
+          <w:sz w:val="52"/>
+          <w:szCs w:val="52"/>
+          <w:lang w:val="fr-FR"/>
+        </w:rPr>
         <w:t>(POO en Python)</w:t>
       </w:r>
     </w:p>
@@ -271,14 +281,6 @@
         </w:rPr>
         <w:t>Préparé par : Safouane Bousakhra</w:t>
       </w:r>
-    </w:p>
-    <w:p>
-      <w:pPr>
-        <w:pStyle w:val="Heading1"/>
-        <w:rPr>
-          <w:lang w:val="fr-FR"/>
-        </w:rPr>
-      </w:pPr>
     </w:p>
     <w:p>
       <w:pPr>
@@ -426,7 +428,6 @@
           <w14:ligatures w14:val="none"/>
         </w:rPr>
       </w:pPr>
-      <w:proofErr w:type="gramStart"/>
       <w:r>
         <w:rPr>
           <w:rFonts w:ascii="Consolas" w:eastAsia="Times New Roman" w:hAnsi="Consolas" w:cs="Times New Roman"/>
@@ -439,7 +440,6 @@
         </w:rPr>
         <w:t>python</w:t>
       </w:r>
-      <w:proofErr w:type="gramEnd"/>
       <w:r>
         <w:rPr>
           <w:rFonts w:ascii="Consolas" w:eastAsia="Times New Roman" w:hAnsi="Consolas" w:cs="Times New Roman"/>
@@ -743,7 +743,6 @@
         </w:rPr>
       </w:pPr>
       <w:proofErr w:type="spellStart"/>
-      <w:proofErr w:type="gramStart"/>
       <w:r>
         <w:rPr>
           <w:rFonts w:ascii="Consolas" w:eastAsia="Times New Roman" w:hAnsi="Consolas" w:cs="Times New Roman"/>
@@ -757,7 +756,6 @@
         <w:t>pip</w:t>
       </w:r>
       <w:proofErr w:type="spellEnd"/>
-      <w:proofErr w:type="gramEnd"/>
       <w:r>
         <w:rPr>
           <w:rFonts w:ascii="Consolas" w:eastAsia="Times New Roman" w:hAnsi="Consolas" w:cs="Times New Roman"/>
@@ -1088,7 +1086,6 @@
           <w14:ligatures w14:val="none"/>
         </w:rPr>
       </w:pPr>
-      <w:proofErr w:type="gramStart"/>
       <w:r>
         <w:rPr>
           <w:rFonts w:ascii="Consolas" w:eastAsia="Times New Roman" w:hAnsi="Consolas" w:cs="Times New Roman"/>
@@ -1099,20 +1096,7 @@
           <w:lang w:val="fr-FR" w:eastAsia="en-GB"/>
           <w14:ligatures w14:val="none"/>
         </w:rPr>
-        <w:t>python</w:t>
-      </w:r>
-      <w:proofErr w:type="gramEnd"/>
-      <w:r>
-        <w:rPr>
-          <w:rFonts w:ascii="Consolas" w:eastAsia="Times New Roman" w:hAnsi="Consolas" w:cs="Times New Roman"/>
-          <w:color w:val="FFFF00"/>
-          <w:kern w:val="0"/>
-          <w:sz w:val="21"/>
-          <w:szCs w:val="21"/>
-          <w:lang w:val="fr-FR" w:eastAsia="en-GB"/>
-          <w14:ligatures w14:val="none"/>
-        </w:rPr>
-        <w:t xml:space="preserve"> </w:t>
+        <w:t xml:space="preserve">python </w:t>
       </w:r>
       <w:r>
         <w:rPr>
@@ -1589,20 +1573,7 @@
           <w:lang w:val="fr-FR" w:eastAsia="en-GB"/>
           <w14:ligatures w14:val="none"/>
         </w:rPr>
-        <w:t>│   ├─</w:t>
-      </w:r>
-      <w:proofErr w:type="gramStart"/>
-      <w:r>
-        <w:rPr>
-          <w:rFonts w:ascii="Consolas" w:eastAsia="Times New Roman" w:hAnsi="Consolas" w:cs="Times New Roman"/>
-          <w:color w:val="CCCCCC"/>
-          <w:kern w:val="0"/>
-          <w:sz w:val="21"/>
-          <w:szCs w:val="21"/>
-          <w:lang w:val="fr-FR" w:eastAsia="en-GB"/>
-          <w14:ligatures w14:val="none"/>
-        </w:rPr>
-        <w:t>─ .</w:t>
+        <w:t>│   ├── .</w:t>
       </w:r>
       <w:proofErr w:type="spellStart"/>
       <w:r>
@@ -1618,7 +1589,6 @@
         <w:t>gitignore</w:t>
       </w:r>
       <w:proofErr w:type="spellEnd"/>
-      <w:proofErr w:type="gramEnd"/>
     </w:p>
     <w:p>
       <w:pPr>
@@ -2850,7 +2820,6 @@
           <w:lang w:val="fr-FR"/>
         </w:rPr>
       </w:pPr>
-      <w:proofErr w:type="gramStart"/>
       <w:r>
         <w:rPr>
           <w:b/>
@@ -2859,18 +2828,7 @@
           <w:szCs w:val="28"/>
           <w:lang w:val="fr-FR"/>
         </w:rPr>
-        <w:t>formulaire</w:t>
-      </w:r>
-      <w:proofErr w:type="gramEnd"/>
-      <w:r>
-        <w:rPr>
-          <w:b/>
-          <w:bCs/>
-          <w:sz w:val="28"/>
-          <w:szCs w:val="28"/>
-          <w:lang w:val="fr-FR"/>
-        </w:rPr>
-        <w:t xml:space="preserve"> HTML dans </w:t>
+        <w:t xml:space="preserve">formulaire HTML dans </w:t>
       </w:r>
       <w:proofErr w:type="spellStart"/>
       <w:r>
@@ -3172,15 +3130,7 @@
       </w:r>
       <w:proofErr w:type="spellEnd"/>
       <w:r>
-        <w:t xml:space="preserve"> and </w:t>
-      </w:r>
-      <w:proofErr w:type="gramStart"/>
-      <w:r>
-        <w:t>also</w:t>
-      </w:r>
-      <w:proofErr w:type="gramEnd"/>
-      <w:r>
-        <w:t xml:space="preserve"> I add the </w:t>
+        <w:t xml:space="preserve"> and also I add the </w:t>
       </w:r>
       <w:proofErr w:type="spellStart"/>
       <w:r>
@@ -3658,7 +3608,6 @@
         <w:t xml:space="preserve">    </w:t>
       </w:r>
       <w:proofErr w:type="spellStart"/>
-      <w:proofErr w:type="gramStart"/>
       <w:r>
         <w:rPr>
           <w:rFonts w:ascii="Consolas" w:eastAsia="Times New Roman" w:hAnsi="Consolas" w:cs="Times New Roman"/>
@@ -3695,7 +3644,6 @@
         </w:rPr>
         <w:t>path</w:t>
       </w:r>
-      <w:proofErr w:type="gramEnd"/>
       <w:r>
         <w:rPr>
           <w:rFonts w:ascii="Consolas" w:eastAsia="Times New Roman" w:hAnsi="Consolas" w:cs="Times New Roman"/>
@@ -4485,7 +4433,6 @@
           <w14:ligatures w14:val="none"/>
         </w:rPr>
       </w:pPr>
-      <w:proofErr w:type="gramStart"/>
       <w:r>
         <w:rPr>
           <w:rFonts w:ascii="Times New Roman" w:eastAsia="Times New Roman" w:hAnsi="Times New Roman" w:cs="Times New Roman"/>
@@ -4497,7 +4444,6 @@
         </w:rPr>
         <w:t>Activation :</w:t>
       </w:r>
-      <w:proofErr w:type="gramEnd"/>
       <w:r>
         <w:rPr>
           <w:rFonts w:ascii="Times New Roman" w:eastAsia="Times New Roman" w:hAnsi="Times New Roman" w:cs="Times New Roman"/>
@@ -4710,7 +4656,6 @@
           <w14:ligatures w14:val="none"/>
         </w:rPr>
       </w:pPr>
-      <w:proofErr w:type="gramStart"/>
       <w:r>
         <w:rPr>
           <w:rFonts w:ascii="Times New Roman" w:eastAsia="Times New Roman" w:hAnsi="Symbol" w:cs="Times New Roman"/>
@@ -4738,19 +4683,7 @@
           <w:lang w:val="fr-FR" w:eastAsia="en-GB"/>
           <w14:ligatures w14:val="none"/>
         </w:rPr>
-        <w:t>Création</w:t>
-      </w:r>
-      <w:proofErr w:type="gramEnd"/>
-      <w:r>
-        <w:rPr>
-          <w:rFonts w:ascii="Times New Roman" w:eastAsia="Times New Roman" w:hAnsi="Times New Roman" w:cs="Times New Roman"/>
-          <w:b/>
-          <w:bCs/>
-          <w:kern w:val="0"/>
-          <w:lang w:val="fr-FR" w:eastAsia="en-GB"/>
-          <w14:ligatures w14:val="none"/>
-        </w:rPr>
-        <w:t xml:space="preserve"> du projet :</w:t>
+        <w:t>Création du projet :</w:t>
       </w:r>
       <w:r>
         <w:rPr>
@@ -4848,7 +4781,6 @@
           <w14:ligatures w14:val="none"/>
         </w:rPr>
       </w:pPr>
-      <w:proofErr w:type="gramStart"/>
       <w:r>
         <w:rPr>
           <w:rFonts w:ascii="Times New Roman" w:eastAsia="Times New Roman" w:hAnsi="Symbol" w:cs="Times New Roman"/>
@@ -4876,19 +4808,7 @@
           <w:lang w:val="fr-FR" w:eastAsia="en-GB"/>
           <w14:ligatures w14:val="none"/>
         </w:rPr>
-        <w:t>Création</w:t>
-      </w:r>
-      <w:proofErr w:type="gramEnd"/>
-      <w:r>
-        <w:rPr>
-          <w:rFonts w:ascii="Times New Roman" w:eastAsia="Times New Roman" w:hAnsi="Times New Roman" w:cs="Times New Roman"/>
-          <w:b/>
-          <w:bCs/>
-          <w:kern w:val="0"/>
-          <w:lang w:val="fr-FR" w:eastAsia="en-GB"/>
-          <w14:ligatures w14:val="none"/>
-        </w:rPr>
-        <w:t xml:space="preserve"> de l'application :</w:t>
+        <w:t>Création de l'application :</w:t>
       </w:r>
       <w:r>
         <w:rPr>
@@ -4958,7 +4878,6 @@
           <w14:ligatures w14:val="none"/>
         </w:rPr>
       </w:pPr>
-      <w:proofErr w:type="gramStart"/>
       <w:r>
         <w:rPr>
           <w:rFonts w:ascii="Times New Roman" w:eastAsia="Times New Roman" w:hAnsi="Symbol" w:cs="Times New Roman"/>
@@ -4986,19 +4905,7 @@
           <w:lang w:val="fr-FR" w:eastAsia="en-GB"/>
           <w14:ligatures w14:val="none"/>
         </w:rPr>
-        <w:t>Enregistrement</w:t>
-      </w:r>
-      <w:proofErr w:type="gramEnd"/>
-      <w:r>
-        <w:rPr>
-          <w:rFonts w:ascii="Times New Roman" w:eastAsia="Times New Roman" w:hAnsi="Times New Roman" w:cs="Times New Roman"/>
-          <w:b/>
-          <w:bCs/>
-          <w:kern w:val="0"/>
-          <w:lang w:val="fr-FR" w:eastAsia="en-GB"/>
-          <w14:ligatures w14:val="none"/>
-        </w:rPr>
-        <w:t xml:space="preserve"> :</w:t>
+        <w:t>Enregistrement :</w:t>
       </w:r>
       <w:r>
         <w:rPr>
@@ -5259,7 +5166,6 @@
         <w:t>(</w:t>
       </w:r>
       <w:proofErr w:type="spellStart"/>
-      <w:proofErr w:type="gramStart"/>
       <w:r>
         <w:rPr>
           <w:rStyle w:val="HTMLCode"/>
@@ -5269,7 +5175,6 @@
         <w:t>text.split</w:t>
       </w:r>
       <w:proofErr w:type="spellEnd"/>
-      <w:proofErr w:type="gramEnd"/>
       <w:r>
         <w:rPr>
           <w:rStyle w:val="HTMLCode"/>
@@ -5365,7 +5270,6 @@
         <w:t xml:space="preserve"> Utilise </w:t>
       </w:r>
       <w:proofErr w:type="spellStart"/>
-      <w:proofErr w:type="gramStart"/>
       <w:r>
         <w:rPr>
           <w:rStyle w:val="HTMLCode"/>
@@ -5381,16 +5285,7 @@
           <w:shd w:val="clear" w:color="auto" w:fill="E8E8E8" w:themeFill="background2"/>
           <w:lang w:val="fr-FR"/>
         </w:rPr>
-        <w:t>(</w:t>
-      </w:r>
-      <w:proofErr w:type="gramEnd"/>
-      <w:r>
-        <w:rPr>
-          <w:rStyle w:val="HTMLCode"/>
-          <w:shd w:val="clear" w:color="auto" w:fill="E8E8E8" w:themeFill="background2"/>
-          <w:lang w:val="fr-FR"/>
-        </w:rPr>
-        <w:t>)</w:t>
+        <w:t>()</w:t>
       </w:r>
       <w:r>
         <w:rPr>
@@ -5425,7 +5320,6 @@
         <w:t xml:space="preserve"> Définit les chemins spécifiques comme </w:t>
       </w:r>
       <w:proofErr w:type="spellStart"/>
-      <w:proofErr w:type="gramStart"/>
       <w:r>
         <w:rPr>
           <w:rStyle w:val="HTMLCode"/>
@@ -5441,16 +5335,7 @@
           <w:shd w:val="clear" w:color="auto" w:fill="E8E8E8" w:themeFill="background2"/>
           <w:lang w:val="fr-FR"/>
         </w:rPr>
-        <w:t>(</w:t>
-      </w:r>
-      <w:proofErr w:type="gramEnd"/>
-      <w:r>
-        <w:rPr>
-          <w:rStyle w:val="HTMLCode"/>
-          <w:shd w:val="clear" w:color="auto" w:fill="E8E8E8" w:themeFill="background2"/>
-          <w:lang w:val="fr-FR"/>
-        </w:rPr>
-        <w:t xml:space="preserve">'', </w:t>
+        <w:t xml:space="preserve">('', </w:t>
       </w:r>
       <w:proofErr w:type="spellStart"/>
       <w:r>
@@ -5755,7 +5640,6 @@
         </w:rPr>
         <w:t xml:space="preserve"> Django : </w:t>
       </w:r>
-      <w:proofErr w:type="gramStart"/>
       <w:r>
         <w:rPr>
           <w:rStyle w:val="HTMLCode"/>
@@ -5774,7 +5658,6 @@
         <w:t>amount</w:t>
       </w:r>
       <w:proofErr w:type="spellEnd"/>
-      <w:proofErr w:type="gramEnd"/>
       <w:r>
         <w:rPr>
           <w:rStyle w:val="HTMLCode"/>

</xml_diff>